<commit_message>
CRM import updates existing clients by CQC location ID; manager names for all priority providers; named first emails
Co-Authored-By: Claude Opus 5.5 <noreply@anthropic.com>
Claude-Session: https://claude.ai/code/session_01XByJMQfkaq2do2XmLu4Dhj
</commit_message>
<xml_diff>
--- a/documents/Haverton Recruitment/8 First Client/This Week Emails.docx
+++ b/documents/Haverton Recruitment/8 First Client/This Week Emails.docx
@@ -248,7 +248,7 @@
               <w:spacing w:after="40" w:line="270"/>
             </w:pPr>
             <w:r>
-              <w:t xml:space="preserve">Replace "Dear Manager" with the manager's name (from the CQC page or the call). For Priority A, check the advert is still live.</w:t>
+              <w:t xml:space="preserve">Names are the Registered Manager or Nominated Individual shown on each CQC page on 25 September 2026. Confirm the name on your call. For Priority A, check the advert is still live.</w:t>
             </w:r>
           </w:p>
         </w:tc>
@@ -354,7 +354,7 @@
           <w:i/>
           <w:iCs/>
         </w:rPr>
-        <w:t xml:space="preserve">Home care, Tonbridge TN9 2HR | Priority A | Email: ask on the call or use their website contact form</w:t>
+        <w:t xml:space="preserve">Home care, Tonbridge TN9 2HR | Priority A | To: Miss Usebia Muzondo | Email: ask on the call or use their website contact form</w:t>
       </w:r>
     </w:p>
     <w:p>
@@ -377,7 +377,7 @@
         <w:spacing w:after="140" w:line="300"/>
       </w:pPr>
       <w:r>
-        <w:t xml:space="preserve">Dear Manager,</w:t>
+        <w:t xml:space="preserve">Dear Miss Muzondo,</w:t>
       </w:r>
     </w:p>
     <w:p>
@@ -497,7 +497,7 @@
           <w:i/>
           <w:iCs/>
         </w:rPr>
-        <w:t xml:space="preserve">Home care, Orpington BR5 3QB | Priority A | Email: ask on the call or use their website contact form</w:t>
+        <w:t xml:space="preserve">Home care, Orpington BR5 3QB | Priority A | To: Miss Chanice Cassandra Baugh-Fredericks | Email: ask on the call or use their website contact form</w:t>
       </w:r>
     </w:p>
     <w:p>
@@ -520,7 +520,7 @@
         <w:spacing w:after="140" w:line="300"/>
       </w:pPr>
       <w:r>
-        <w:t xml:space="preserve">Dear Manager,</w:t>
+        <w:t xml:space="preserve">Dear Miss Baugh-Fredericks,</w:t>
       </w:r>
     </w:p>
     <w:p>
@@ -640,7 +640,7 @@
           <w:i/>
           <w:iCs/>
         </w:rPr>
-        <w:t xml:space="preserve">Home care, Swanley BR8 7WF | Priority A | Email: ask on the call or use their website contact form</w:t>
+        <w:t xml:space="preserve">Home care, Swanley BR8 7WF | Priority A | To: Mrs Stephanie Christina Kimberley Hasleham | Email: ask on the call or use their website contact form</w:t>
       </w:r>
     </w:p>
     <w:p>
@@ -663,7 +663,7 @@
         <w:spacing w:after="140" w:line="300"/>
       </w:pPr>
       <w:r>
-        <w:t xml:space="preserve">Dear Manager,</w:t>
+        <w:t xml:space="preserve">Dear Mrs Hasleham,</w:t>
       </w:r>
     </w:p>
     <w:p>
@@ -783,7 +783,7 @@
           <w:i/>
           <w:iCs/>
         </w:rPr>
-        <w:t xml:space="preserve">Supported living and home care, Bromley BR2 9LD | Priority A | Email: ask on the call or use their website contact form</w:t>
+        <w:t xml:space="preserve">Supported living and home care, Bromley BR2 9LD | Priority A | To: Mr Brett Anthony Rutter | Email: ask on the call or use their website contact form</w:t>
       </w:r>
     </w:p>
     <w:p>
@@ -806,7 +806,7 @@
         <w:spacing w:after="140" w:line="300"/>
       </w:pPr>
       <w:r>
-        <w:t xml:space="preserve">Dear Manager,</w:t>
+        <w:t xml:space="preserve">Dear Mr Rutter,</w:t>
       </w:r>
     </w:p>
     <w:p>
@@ -926,7 +926,7 @@
           <w:i/>
           <w:iCs/>
         </w:rPr>
-        <w:t xml:space="preserve">Home care, Erith DA8 1AT | Priority A | Email: ask on the call or use their website contact form</w:t>
+        <w:t xml:space="preserve">Home care, Erith DA8 1AT | Priority A | To: Mr Ram Chandra Thapa | Email: ask on the call or use their website contact form</w:t>
       </w:r>
     </w:p>
     <w:p>
@@ -949,7 +949,7 @@
         <w:spacing w:after="140" w:line="300"/>
       </w:pPr>
       <w:r>
-        <w:t xml:space="preserve">Dear Manager,</w:t>
+        <w:t xml:space="preserve">Dear Mr Thapa,</w:t>
       </w:r>
     </w:p>
     <w:p>
@@ -1069,7 +1069,7 @@
           <w:i/>
           <w:iCs/>
         </w:rPr>
-        <w:t xml:space="preserve">Nursing home, Swanley BR8 7FP | Priority B | Email: ask on the call or use their website contact form</w:t>
+        <w:t xml:space="preserve">Nursing home, Swanley BR8 7FP | Priority B | To: Mrs Damilola Abimbola Baiyewu | Email: ask on the call or use their website contact form</w:t>
       </w:r>
     </w:p>
     <w:p>
@@ -1092,7 +1092,7 @@
         <w:spacing w:after="140" w:line="300"/>
       </w:pPr>
       <w:r>
-        <w:t xml:space="preserve">Dear Manager,</w:t>
+        <w:t xml:space="preserve">Dear Mrs Baiyewu,</w:t>
       </w:r>
     </w:p>
     <w:p>
@@ -1212,7 +1212,7 @@
           <w:i/>
           <w:iCs/>
         </w:rPr>
-        <w:t xml:space="preserve">Nursing home, Dartford DA2 7QT | Priority B | Email: ask on the call or use their website contact form</w:t>
+        <w:t xml:space="preserve">Nursing home, Dartford DA2 7QT | Priority B | To: Mrs Sarika Puthalath | Email: ask on the call or use their website contact form</w:t>
       </w:r>
     </w:p>
     <w:p>
@@ -1235,7 +1235,7 @@
         <w:spacing w:after="140" w:line="300"/>
       </w:pPr>
       <w:r>
-        <w:t xml:space="preserve">Dear Manager,</w:t>
+        <w:t xml:space="preserve">Dear Mrs Puthalath,</w:t>
       </w:r>
     </w:p>
     <w:p>
@@ -1355,7 +1355,7 @@
           <w:i/>
           <w:iCs/>
         </w:rPr>
-        <w:t xml:space="preserve">Nursing home, Dartford DA1 2GA | Priority B | Email: info@westhillcarehome.com</w:t>
+        <w:t xml:space="preserve">Nursing home, Dartford DA1 2GA | Priority B | To: Miss Lauren Justine Griffin | Email: info@westhillcarehome.com</w:t>
       </w:r>
     </w:p>
     <w:p>
@@ -1378,7 +1378,7 @@
         <w:spacing w:after="140" w:line="300"/>
       </w:pPr>
       <w:r>
-        <w:t xml:space="preserve">Dear Manager,</w:t>
+        <w:t xml:space="preserve">Dear Miss Griffin,</w:t>
       </w:r>
     </w:p>
     <w:p>
@@ -1498,7 +1498,7 @@
           <w:i/>
           <w:iCs/>
         </w:rPr>
-        <w:t xml:space="preserve">Nursing home, Dartford DA2 6EG | Priority B | Email: ask on the call or use their website contact form</w:t>
+        <w:t xml:space="preserve">Nursing home, Dartford DA2 6EG | Priority B | To: Dr Marlon Zacarias Soriano | Email: ask on the call or use their website contact form</w:t>
       </w:r>
     </w:p>
     <w:p>
@@ -1521,7 +1521,7 @@
         <w:spacing w:after="140" w:line="300"/>
       </w:pPr>
       <w:r>
-        <w:t xml:space="preserve">Dear Manager,</w:t>
+        <w:t xml:space="preserve">Dear Dr Soriano,</w:t>
       </w:r>
     </w:p>
     <w:p>
@@ -1641,7 +1641,7 @@
           <w:i/>
           <w:iCs/>
         </w:rPr>
-        <w:t xml:space="preserve">Nursing home, Sidcup DA15 7HJ | Priority B | Email: ask on the call or use their website contact form</w:t>
+        <w:t xml:space="preserve">Nursing home, Sidcup DA15 7HJ | Priority B | To: Mrs Sheena John | Email: ask on the call or use their website contact form</w:t>
       </w:r>
     </w:p>
     <w:p>
@@ -1664,7 +1664,7 @@
         <w:spacing w:after="140" w:line="300"/>
       </w:pPr>
       <w:r>
-        <w:t xml:space="preserve">Dear Manager,</w:t>
+        <w:t xml:space="preserve">Dear Mrs John,</w:t>
       </w:r>
     </w:p>
     <w:p>
@@ -1784,7 +1784,7 @@
           <w:i/>
           <w:iCs/>
         </w:rPr>
-        <w:t xml:space="preserve">Nursing home, Chislehurst BR7 6PE | Priority B | Email: ask on the call or use their website contact form</w:t>
+        <w:t xml:space="preserve">Nursing home, Chislehurst BR7 6PE | Priority B | To: Mrs Joanna Wojtach | Email: ask on the call or use their website contact form</w:t>
       </w:r>
     </w:p>
     <w:p>
@@ -1807,7 +1807,7 @@
         <w:spacing w:after="140" w:line="300"/>
       </w:pPr>
       <w:r>
-        <w:t xml:space="preserve">Dear Manager,</w:t>
+        <w:t xml:space="preserve">Dear Mrs Wojtach,</w:t>
       </w:r>
     </w:p>
     <w:p>
@@ -1927,7 +1927,7 @@
           <w:i/>
           <w:iCs/>
         </w:rPr>
-        <w:t xml:space="preserve">Residential home, Chislehurst BR7 6LL | Priority B | Email: ask on the call or use their website contact form</w:t>
+        <w:t xml:space="preserve">Residential home, Chislehurst BR7 6LL | Priority B | To: Miss Tanya Angena Young | Email: ask on the call or use their website contact form</w:t>
       </w:r>
     </w:p>
     <w:p>
@@ -1950,7 +1950,7 @@
         <w:spacing w:after="140" w:line="300"/>
       </w:pPr>
       <w:r>
-        <w:t xml:space="preserve">Dear Manager,</w:t>
+        <w:t xml:space="preserve">Dear Miss Young,</w:t>
       </w:r>
     </w:p>
     <w:p>
@@ -2070,7 +2070,7 @@
           <w:i/>
           <w:iCs/>
         </w:rPr>
-        <w:t xml:space="preserve">Nursing home, Bexleyheath DA7 4EU | Priority B | Email: ask on the call or use their website contact form</w:t>
+        <w:t xml:space="preserve">Nursing home, Bexleyheath DA7 4EU | Priority B | To: Mr Antonio Kamal Carthigeya Thirulinganathan | Email: ask on the call or use their website contact form</w:t>
       </w:r>
     </w:p>
     <w:p>
@@ -2085,15 +2085,15 @@
         <w:t xml:space="preserve">Subject:</w:t>
       </w:r>
       <w:r>
-        <w:t xml:space="preserve"> Care recruitment for Maples Care Home</w:t>
-      </w:r>
-    </w:p>
-    <w:p>
-      <w:pPr>
-        <w:spacing w:after="140" w:line="300"/>
-      </w:pPr>
-      <w:r>
-        <w:t xml:space="preserve">Dear Manager,</w:t>
+        <w:t xml:space="preserve"> Registered Manager recruitment for Maples Care Home</w:t>
+      </w:r>
+    </w:p>
+    <w:p>
+      <w:pPr>
+        <w:spacing w:after="140" w:line="300"/>
+      </w:pPr>
+      <w:r>
+        <w:t xml:space="preserve">Dear Mr Thirulinganathan,</w:t>
       </w:r>
     </w:p>
     <w:p>
@@ -2109,7 +2109,579 @@
         <w:spacing w:after="140" w:line="300"/>
       </w:pPr>
       <w:r>
-        <w:t xml:space="preserve">I am contacting a small number of providers close to Swanley, including Maples Care Home in Bexleyheath.</w:t>
+        <w:t xml:space="preserve">I understand Maples Care Home may be looking to appoint a Registered Manager. If that is right, I would be glad to help.</w:t>
+      </w:r>
+    </w:p>
+    <w:p>
+      <w:pPr>
+        <w:spacing w:after="140" w:line="300"/>
+      </w:pPr>
+      <w:r>
+        <w:t xml:space="preserve">Having done the job myself, I assess manager candidates on how they have actually run a service: safeguarding, medication governance, audits, staffing and working with CQC, not just their CV.</w:t>
+      </w:r>
+    </w:p>
+    <w:p>
+      <w:pPr>
+        <w:spacing w:after="140" w:line="300"/>
+      </w:pPr>
+      <w:r>
+        <w:t xml:space="preserve">You pay nothing unless you appoint someone I introduce, and our terms include a free replacement if they leave in the first 30 days.</w:t>
+      </w:r>
+    </w:p>
+    <w:p>
+      <w:pPr>
+        <w:spacing w:after="140" w:line="300"/>
+      </w:pPr>
+      <w:r>
+        <w:t xml:space="preserve">Could we speak for 15 minutes this week? If I have got this wrong, please accept my apologies.</w:t>
+      </w:r>
+    </w:p>
+    <w:p>
+      <w:pPr>
+        <w:spacing w:after="140" w:line="300"/>
+      </w:pPr>
+      <w:r>
+        <w:t xml:space="preserve">Kind regards,</w:t>
+      </w:r>
+    </w:p>
+    <w:p>
+      <w:pPr>
+        <w:spacing w:after="140" w:line="300"/>
+      </w:pPr>
+      <w:r>
+        <w:rPr>
+          <w:b/>
+          <w:bCs/>
+        </w:rPr>
+        <w:t xml:space="preserve">Suroj Aryal</w:t>
+      </w:r>
+    </w:p>
+    <w:p>
+      <w:pPr>
+        <w:spacing w:after="140" w:line="300"/>
+      </w:pPr>
+      <w:r>
+        <w:t xml:space="preserve">Founder and Director, Haverton Recruitment And Staffing</w:t>
+      </w:r>
+    </w:p>
+    <w:p>
+      <w:pPr>
+        <w:spacing w:after="140" w:line="300"/>
+      </w:pPr>
+      <w:r>
+        <w:t xml:space="preserve">01322 879778 | info@havertoncare.co.uk | havertoncare.co.uk</w:t>
+      </w:r>
+    </w:p>
+    <w:p>
+      <w:pPr>
+        <w:spacing w:after="140" w:line="300"/>
+      </w:pPr>
+      <w:r>
+        <w:rPr>
+          <w:i/>
+          <w:iCs/>
+        </w:rPr>
+        <w:t xml:space="preserve">Haverton Care Limited, registered in England and Wales, company number 17025493. Registered office: 128 City Road, London, EC1V 2NX.</w:t>
+      </w:r>
+    </w:p>
+    <w:p>
+      <w:pPr>
+        <w:spacing w:after="140" w:line="300"/>
+      </w:pPr>
+      <w:r>
+        <w:rPr>
+          <w:i/>
+          <w:iCs/>
+        </w:rPr>
+        <w:t xml:space="preserve">If you would rather not hear from me, just reply "no thanks" and I will not contact you again.</w:t>
+      </w:r>
+    </w:p>
+    <w:p>
+      <w:pPr>
+        <w:pStyle w:val="Heading1"/>
+      </w:pPr>
+      <w:r>
+        <w:t xml:space="preserve">14. Loring Hall Limited</w:t>
+      </w:r>
+    </w:p>
+    <w:p>
+      <w:pPr>
+        <w:spacing w:after="140" w:line="300"/>
+      </w:pPr>
+      <w:r>
+        <w:rPr>
+          <w:i/>
+          <w:iCs/>
+        </w:rPr>
+        <w:t xml:space="preserve">Residential home, Sidcup DA14 5ES | Priority B | To: Mr Paul Edward George Emile | Email: ask on the call or use their website contact form</w:t>
+      </w:r>
+    </w:p>
+    <w:p>
+      <w:pPr>
+        <w:spacing w:after="140" w:line="300"/>
+      </w:pPr>
+      <w:r>
+        <w:rPr>
+          <w:b/>
+          <w:bCs/>
+        </w:rPr>
+        <w:t xml:space="preserve">Subject:</w:t>
+      </w:r>
+      <w:r>
+        <w:t xml:space="preserve"> Care recruitment for Loring Hall</w:t>
+      </w:r>
+    </w:p>
+    <w:p>
+      <w:pPr>
+        <w:spacing w:after="140" w:line="300"/>
+      </w:pPr>
+      <w:r>
+        <w:t xml:space="preserve">Dear Mr Emile,</w:t>
+      </w:r>
+    </w:p>
+    <w:p>
+      <w:pPr>
+        <w:spacing w:after="140" w:line="300"/>
+      </w:pPr>
+      <w:r>
+        <w:t xml:space="preserve">I am a former CQC Registered Manager with around 15 years in adult social care, and I have set up Haverton Recruitment, a local specialist recruitment agency for care providers around Swanley, Dartford, Bexley and Bromley.</w:t>
+      </w:r>
+    </w:p>
+    <w:p>
+      <w:pPr>
+        <w:spacing w:after="140" w:line="300"/>
+      </w:pPr>
+      <w:r>
+        <w:t xml:space="preserve">I am contacting a small number of providers close to Swanley, including Loring Hall in Sidcup.</w:t>
+      </w:r>
+    </w:p>
+    <w:p>
+      <w:pPr>
+        <w:spacing w:after="140" w:line="300"/>
+      </w:pPr>
+      <w:r>
+        <w:t xml:space="preserve">I know how important it is to find support staff and seniors who understand positive behaviour support and person-centred practice for people with learning disabilities. If you have roles like that now or coming up, I would be glad to help.</w:t>
+      </w:r>
+    </w:p>
+    <w:p>
+      <w:pPr>
+        <w:spacing w:after="140" w:line="300"/>
+      </w:pPr>
+      <w:r>
+        <w:t xml:space="preserve">I screen every candidate by interview and check work history, references and qualifications before any introduction. You pay only if you hire someone I introduce.</w:t>
+      </w:r>
+    </w:p>
+    <w:p>
+      <w:pPr>
+        <w:spacing w:after="140" w:line="300"/>
+      </w:pPr>
+      <w:r>
+        <w:t xml:space="preserve">Could we speak for 15 minutes in the next week or two?</w:t>
+      </w:r>
+    </w:p>
+    <w:p>
+      <w:pPr>
+        <w:spacing w:after="140" w:line="300"/>
+      </w:pPr>
+      <w:r>
+        <w:t xml:space="preserve">Kind regards,</w:t>
+      </w:r>
+    </w:p>
+    <w:p>
+      <w:pPr>
+        <w:spacing w:after="140" w:line="300"/>
+      </w:pPr>
+      <w:r>
+        <w:rPr>
+          <w:b/>
+          <w:bCs/>
+        </w:rPr>
+        <w:t xml:space="preserve">Suroj Aryal</w:t>
+      </w:r>
+    </w:p>
+    <w:p>
+      <w:pPr>
+        <w:spacing w:after="140" w:line="300"/>
+      </w:pPr>
+      <w:r>
+        <w:t xml:space="preserve">Founder and Director, Haverton Recruitment And Staffing</w:t>
+      </w:r>
+    </w:p>
+    <w:p>
+      <w:pPr>
+        <w:spacing w:after="140" w:line="300"/>
+      </w:pPr>
+      <w:r>
+        <w:t xml:space="preserve">01322 879778 | info@havertoncare.co.uk | havertoncare.co.uk</w:t>
+      </w:r>
+    </w:p>
+    <w:p>
+      <w:pPr>
+        <w:spacing w:after="140" w:line="300"/>
+      </w:pPr>
+      <w:r>
+        <w:rPr>
+          <w:i/>
+          <w:iCs/>
+        </w:rPr>
+        <w:t xml:space="preserve">Haverton Care Limited, registered in England and Wales, company number 17025493. Registered office: 128 City Road, London, EC1V 2NX.</w:t>
+      </w:r>
+    </w:p>
+    <w:p>
+      <w:pPr>
+        <w:spacing w:after="140" w:line="300"/>
+      </w:pPr>
+      <w:r>
+        <w:rPr>
+          <w:i/>
+          <w:iCs/>
+        </w:rPr>
+        <w:t xml:space="preserve">If you would rather not hear from me, just reply "no thanks" and I will not contact you again.</w:t>
+      </w:r>
+    </w:p>
+    <w:p>
+      <w:pPr>
+        <w:pStyle w:val="Heading1"/>
+      </w:pPr>
+      <w:r>
+        <w:t xml:space="preserve">15. The Drive</w:t>
+      </w:r>
+    </w:p>
+    <w:p>
+      <w:pPr>
+        <w:spacing w:after="140" w:line="300"/>
+      </w:pPr>
+      <w:r>
+        <w:rPr>
+          <w:i/>
+          <w:iCs/>
+        </w:rPr>
+        <w:t xml:space="preserve">Residential home, Sidcup DA14 4ER | Priority B | To: Miss Abiola Oluwayemisi Odukale | Email: ask on the call or use their website contact form</w:t>
+      </w:r>
+    </w:p>
+    <w:p>
+      <w:pPr>
+        <w:spacing w:after="140" w:line="300"/>
+      </w:pPr>
+      <w:r>
+        <w:rPr>
+          <w:b/>
+          <w:bCs/>
+        </w:rPr>
+        <w:t xml:space="preserve">Subject:</w:t>
+      </w:r>
+      <w:r>
+        <w:t xml:space="preserve"> Care recruitment for The Drive</w:t>
+      </w:r>
+    </w:p>
+    <w:p>
+      <w:pPr>
+        <w:spacing w:after="140" w:line="300"/>
+      </w:pPr>
+      <w:r>
+        <w:t xml:space="preserve">Dear Miss Odukale,</w:t>
+      </w:r>
+    </w:p>
+    <w:p>
+      <w:pPr>
+        <w:spacing w:after="140" w:line="300"/>
+      </w:pPr>
+      <w:r>
+        <w:t xml:space="preserve">I am a former CQC Registered Manager with around 15 years in adult social care, and I have set up Haverton Recruitment, a local specialist recruitment agency for care providers around Swanley, Dartford, Bexley and Bromley.</w:t>
+      </w:r>
+    </w:p>
+    <w:p>
+      <w:pPr>
+        <w:spacing w:after="140" w:line="300"/>
+      </w:pPr>
+      <w:r>
+        <w:t xml:space="preserve">I am contacting a small number of providers close to Swanley, including The Drive in Sidcup.</w:t>
+      </w:r>
+    </w:p>
+    <w:p>
+      <w:pPr>
+        <w:spacing w:after="140" w:line="300"/>
+      </w:pPr>
+      <w:r>
+        <w:t xml:space="preserve">I know how important it is to find support staff and seniors who understand positive behaviour support and person-centred practice for people with learning disabilities. If you have roles like that now or coming up, I would be glad to help.</w:t>
+      </w:r>
+    </w:p>
+    <w:p>
+      <w:pPr>
+        <w:spacing w:after="140" w:line="300"/>
+      </w:pPr>
+      <w:r>
+        <w:t xml:space="preserve">I screen every candidate by interview and check work history, references and qualifications before any introduction. You pay only if you hire someone I introduce.</w:t>
+      </w:r>
+    </w:p>
+    <w:p>
+      <w:pPr>
+        <w:spacing w:after="140" w:line="300"/>
+      </w:pPr>
+      <w:r>
+        <w:t xml:space="preserve">Could we speak for 15 minutes in the next week or two?</w:t>
+      </w:r>
+    </w:p>
+    <w:p>
+      <w:pPr>
+        <w:spacing w:after="140" w:line="300"/>
+      </w:pPr>
+      <w:r>
+        <w:t xml:space="preserve">Kind regards,</w:t>
+      </w:r>
+    </w:p>
+    <w:p>
+      <w:pPr>
+        <w:spacing w:after="140" w:line="300"/>
+      </w:pPr>
+      <w:r>
+        <w:rPr>
+          <w:b/>
+          <w:bCs/>
+        </w:rPr>
+        <w:t xml:space="preserve">Suroj Aryal</w:t>
+      </w:r>
+    </w:p>
+    <w:p>
+      <w:pPr>
+        <w:spacing w:after="140" w:line="300"/>
+      </w:pPr>
+      <w:r>
+        <w:t xml:space="preserve">Founder and Director, Haverton Recruitment And Staffing</w:t>
+      </w:r>
+    </w:p>
+    <w:p>
+      <w:pPr>
+        <w:spacing w:after="140" w:line="300"/>
+      </w:pPr>
+      <w:r>
+        <w:t xml:space="preserve">01322 879778 | info@havertoncare.co.uk | havertoncare.co.uk</w:t>
+      </w:r>
+    </w:p>
+    <w:p>
+      <w:pPr>
+        <w:spacing w:after="140" w:line="300"/>
+      </w:pPr>
+      <w:r>
+        <w:rPr>
+          <w:i/>
+          <w:iCs/>
+        </w:rPr>
+        <w:t xml:space="preserve">Haverton Care Limited, registered in England and Wales, company number 17025493. Registered office: 128 City Road, London, EC1V 2NX.</w:t>
+      </w:r>
+    </w:p>
+    <w:p>
+      <w:pPr>
+        <w:spacing w:after="140" w:line="300"/>
+      </w:pPr>
+      <w:r>
+        <w:rPr>
+          <w:i/>
+          <w:iCs/>
+        </w:rPr>
+        <w:t xml:space="preserve">If you would rather not hear from me, just reply "no thanks" and I will not contact you again.</w:t>
+      </w:r>
+    </w:p>
+    <w:p>
+      <w:pPr>
+        <w:pStyle w:val="Heading1"/>
+      </w:pPr>
+      <w:r>
+        <w:t xml:space="preserve">16. Groveland Park Care Home</w:t>
+      </w:r>
+    </w:p>
+    <w:p>
+      <w:pPr>
+        <w:spacing w:after="140" w:line="300"/>
+      </w:pPr>
+      <w:r>
+        <w:rPr>
+          <w:i/>
+          <w:iCs/>
+        </w:rPr>
+        <w:t xml:space="preserve">Residential home, Bexleyheath DA7 6EF | Priority B | To: Ms Caroline Susan Cheeseman | Email: ask on the call or use their website contact form</w:t>
+      </w:r>
+    </w:p>
+    <w:p>
+      <w:pPr>
+        <w:spacing w:after="140" w:line="300"/>
+      </w:pPr>
+      <w:r>
+        <w:rPr>
+          <w:b/>
+          <w:bCs/>
+        </w:rPr>
+        <w:t xml:space="preserve">Subject:</w:t>
+      </w:r>
+      <w:r>
+        <w:t xml:space="preserve"> Care recruitment for Groveland Park Care Home</w:t>
+      </w:r>
+    </w:p>
+    <w:p>
+      <w:pPr>
+        <w:spacing w:after="140" w:line="300"/>
+      </w:pPr>
+      <w:r>
+        <w:t xml:space="preserve">Dear Ms Cheeseman,</w:t>
+      </w:r>
+    </w:p>
+    <w:p>
+      <w:pPr>
+        <w:spacing w:after="140" w:line="300"/>
+      </w:pPr>
+      <w:r>
+        <w:t xml:space="preserve">I am a former CQC Registered Manager with around 15 years in adult social care, and I have set up Haverton Recruitment, a local specialist recruitment agency for care providers around Swanley, Dartford, Bexley and Bromley.</w:t>
+      </w:r>
+    </w:p>
+    <w:p>
+      <w:pPr>
+        <w:spacing w:after="140" w:line="300"/>
+      </w:pPr>
+      <w:r>
+        <w:t xml:space="preserve">I am contacting a small number of providers close to Swanley, including Groveland Park Care Home in Bexleyheath.</w:t>
+      </w:r>
+    </w:p>
+    <w:p>
+      <w:pPr>
+        <w:spacing w:after="140" w:line="300"/>
+      </w:pPr>
+      <w:r>
+        <w:t xml:space="preserve">If you have care, senior or management roles that are hard to fill, now or in the next few months, I would be glad to help.</w:t>
+      </w:r>
+    </w:p>
+    <w:p>
+      <w:pPr>
+        <w:spacing w:after="140" w:line="300"/>
+      </w:pPr>
+      <w:r>
+        <w:t xml:space="preserve">I screen every candidate by interview and check work history, references and qualifications before any introduction. You pay only if you hire someone I introduce.</w:t>
+      </w:r>
+    </w:p>
+    <w:p>
+      <w:pPr>
+        <w:spacing w:after="140" w:line="300"/>
+      </w:pPr>
+      <w:r>
+        <w:t xml:space="preserve">Could we speak for 15 minutes in the next week or two?</w:t>
+      </w:r>
+    </w:p>
+    <w:p>
+      <w:pPr>
+        <w:spacing w:after="140" w:line="300"/>
+      </w:pPr>
+      <w:r>
+        <w:t xml:space="preserve">Kind regards,</w:t>
+      </w:r>
+    </w:p>
+    <w:p>
+      <w:pPr>
+        <w:spacing w:after="140" w:line="300"/>
+      </w:pPr>
+      <w:r>
+        <w:rPr>
+          <w:b/>
+          <w:bCs/>
+        </w:rPr>
+        <w:t xml:space="preserve">Suroj Aryal</w:t>
+      </w:r>
+    </w:p>
+    <w:p>
+      <w:pPr>
+        <w:spacing w:after="140" w:line="300"/>
+      </w:pPr>
+      <w:r>
+        <w:t xml:space="preserve">Founder and Director, Haverton Recruitment And Staffing</w:t>
+      </w:r>
+    </w:p>
+    <w:p>
+      <w:pPr>
+        <w:spacing w:after="140" w:line="300"/>
+      </w:pPr>
+      <w:r>
+        <w:t xml:space="preserve">01322 879778 | info@havertoncare.co.uk | havertoncare.co.uk</w:t>
+      </w:r>
+    </w:p>
+    <w:p>
+      <w:pPr>
+        <w:spacing w:after="140" w:line="300"/>
+      </w:pPr>
+      <w:r>
+        <w:rPr>
+          <w:i/>
+          <w:iCs/>
+        </w:rPr>
+        <w:t xml:space="preserve">Haverton Care Limited, registered in England and Wales, company number 17025493. Registered office: 128 City Road, London, EC1V 2NX.</w:t>
+      </w:r>
+    </w:p>
+    <w:p>
+      <w:pPr>
+        <w:spacing w:after="140" w:line="300"/>
+      </w:pPr>
+      <w:r>
+        <w:rPr>
+          <w:i/>
+          <w:iCs/>
+        </w:rPr>
+        <w:t xml:space="preserve">If you would rather not hear from me, just reply "no thanks" and I will not contact you again.</w:t>
+      </w:r>
+    </w:p>
+    <w:p>
+      <w:pPr>
+        <w:pStyle w:val="Heading1"/>
+      </w:pPr>
+      <w:r>
+        <w:t xml:space="preserve">17. Russell Court Nursing Home</w:t>
+      </w:r>
+    </w:p>
+    <w:p>
+      <w:pPr>
+        <w:spacing w:after="140" w:line="300"/>
+      </w:pPr>
+      <w:r>
+        <w:rPr>
+          <w:i/>
+          <w:iCs/>
+        </w:rPr>
+        <w:t xml:space="preserve">Nursing home, Longfield DA3 7RY | Priority B | To: Mrs Rachel Emma Caveney | Email: ask on the call or use their website contact form</w:t>
+      </w:r>
+    </w:p>
+    <w:p>
+      <w:pPr>
+        <w:spacing w:after="140" w:line="300"/>
+      </w:pPr>
+      <w:r>
+        <w:rPr>
+          <w:b/>
+          <w:bCs/>
+        </w:rPr>
+        <w:t xml:space="preserve">Subject:</w:t>
+      </w:r>
+      <w:r>
+        <w:t xml:space="preserve"> Care recruitment for Russell Court Nursing Home</w:t>
+      </w:r>
+    </w:p>
+    <w:p>
+      <w:pPr>
+        <w:spacing w:after="140" w:line="300"/>
+      </w:pPr>
+      <w:r>
+        <w:t xml:space="preserve">Dear Mrs Caveney,</w:t>
+      </w:r>
+    </w:p>
+    <w:p>
+      <w:pPr>
+        <w:spacing w:after="140" w:line="300"/>
+      </w:pPr>
+      <w:r>
+        <w:t xml:space="preserve">I am a former CQC Registered Manager with around 15 years in adult social care, and I have set up Haverton Recruitment, a local specialist recruitment agency for care providers around Swanley, Dartford, Bexley and Bromley.</w:t>
+      </w:r>
+    </w:p>
+    <w:p>
+      <w:pPr>
+        <w:spacing w:after="140" w:line="300"/>
+      </w:pPr>
+      <w:r>
+        <w:t xml:space="preserve">I am contacting a small number of providers close to Swanley, including Russell Court Nursing Home in Longfield.</w:t>
       </w:r>
     </w:p>
     <w:p>
@@ -2201,19 +2773,19 @@
         <w:pStyle w:val="Heading1"/>
       </w:pPr>
       <w:r>
-        <w:t xml:space="preserve">14. Loring Hall Limited</w:t>
-      </w:r>
-    </w:p>
-    <w:p>
-      <w:pPr>
-        <w:spacing w:after="140" w:line="300"/>
-      </w:pPr>
-      <w:r>
-        <w:rPr>
-          <w:i/>
-          <w:iCs/>
-        </w:rPr>
-        <w:t xml:space="preserve">Residential home, Sidcup DA14 5ES | Priority B | Email: ask on the call or use their website contact form</w:t>
+        <w:t xml:space="preserve">18. Bramblings Residential Home</w:t>
+      </w:r>
+    </w:p>
+    <w:p>
+      <w:pPr>
+        <w:spacing w:after="140" w:line="300"/>
+      </w:pPr>
+      <w:r>
+        <w:rPr>
+          <w:i/>
+          <w:iCs/>
+        </w:rPr>
+        <w:t xml:space="preserve">Residential home, Hartley DA3 7PE | Priority B | To: Mrs Jennifer Bard | Email: info@bramblingscare.co.uk</w:t>
       </w:r>
     </w:p>
     <w:p>
@@ -2228,15 +2800,15 @@
         <w:t xml:space="preserve">Subject:</w:t>
       </w:r>
       <w:r>
-        <w:t xml:space="preserve"> Care recruitment for Loring Hall</w:t>
-      </w:r>
-    </w:p>
-    <w:p>
-      <w:pPr>
-        <w:spacing w:after="140" w:line="300"/>
-      </w:pPr>
-      <w:r>
-        <w:t xml:space="preserve">Dear Manager,</w:t>
+        <w:t xml:space="preserve"> Care recruitment for Bramblings Residential Home</w:t>
+      </w:r>
+    </w:p>
+    <w:p>
+      <w:pPr>
+        <w:spacing w:after="140" w:line="300"/>
+      </w:pPr>
+      <w:r>
+        <w:t xml:space="preserve">Dear Mrs Bard,</w:t>
       </w:r>
     </w:p>
     <w:p>
@@ -2252,15 +2824,15 @@
         <w:spacing w:after="140" w:line="300"/>
       </w:pPr>
       <w:r>
-        <w:t xml:space="preserve">I am contacting a small number of providers close to Swanley, including Loring Hall in Sidcup.</w:t>
-      </w:r>
-    </w:p>
-    <w:p>
-      <w:pPr>
-        <w:spacing w:after="140" w:line="300"/>
-      </w:pPr>
-      <w:r>
-        <w:t xml:space="preserve">I know how important it is to find support staff and seniors who understand positive behaviour support and person-centred practice for people with learning disabilities. If you have roles like that now or coming up, I would be glad to help.</w:t>
+        <w:t xml:space="preserve">I am contacting a small number of providers close to Swanley, including Bramblings Residential Home in Hartley.</w:t>
+      </w:r>
+    </w:p>
+    <w:p>
+      <w:pPr>
+        <w:spacing w:after="140" w:line="300"/>
+      </w:pPr>
+      <w:r>
+        <w:t xml:space="preserve">If you have care, senior or management roles that are hard to fill, now or in the next few months, I would be glad to help.</w:t>
       </w:r>
     </w:p>
     <w:p>
@@ -2344,19 +2916,19 @@
         <w:pStyle w:val="Heading1"/>
       </w:pPr>
       <w:r>
-        <w:t xml:space="preserve">15. The Drive</w:t>
-      </w:r>
-    </w:p>
-    <w:p>
-      <w:pPr>
-        <w:spacing w:after="140" w:line="300"/>
-      </w:pPr>
-      <w:r>
-        <w:rPr>
-          <w:i/>
-          <w:iCs/>
-        </w:rPr>
-        <w:t xml:space="preserve">Residential home, Sidcup DA14 4ER | Priority B | Email: ask on the call or use their website contact form</w:t>
+        <w:t xml:space="preserve">19. Kent Carers Limited - Head Office</w:t>
+      </w:r>
+    </w:p>
+    <w:p>
+      <w:pPr>
+        <w:spacing w:after="140" w:line="300"/>
+      </w:pPr>
+      <w:r>
+        <w:rPr>
+          <w:i/>
+          <w:iCs/>
+        </w:rPr>
+        <w:t xml:space="preserve">Home care, Dartford DA2 7SL | Priority C | To: Mrs Jane Lisa Stevenson | Email: info@kentcarers.co.uk</w:t>
       </w:r>
     </w:p>
     <w:p>
@@ -2371,15 +2943,15 @@
         <w:t xml:space="preserve">Subject:</w:t>
       </w:r>
       <w:r>
-        <w:t xml:space="preserve"> Care recruitment for The Drive</w:t>
-      </w:r>
-    </w:p>
-    <w:p>
-      <w:pPr>
-        <w:spacing w:after="140" w:line="300"/>
-      </w:pPr>
-      <w:r>
-        <w:t xml:space="preserve">Dear Manager,</w:t>
+        <w:t xml:space="preserve"> Care recruitment for Kent Carers Limited</w:t>
+      </w:r>
+    </w:p>
+    <w:p>
+      <w:pPr>
+        <w:spacing w:after="140" w:line="300"/>
+      </w:pPr>
+      <w:r>
+        <w:t xml:space="preserve">Dear Mrs Stevenson,</w:t>
       </w:r>
     </w:p>
     <w:p>
@@ -2395,15 +2967,15 @@
         <w:spacing w:after="140" w:line="300"/>
       </w:pPr>
       <w:r>
-        <w:t xml:space="preserve">I am contacting a small number of providers close to Swanley, including The Drive in Sidcup.</w:t>
-      </w:r>
-    </w:p>
-    <w:p>
-      <w:pPr>
-        <w:spacing w:after="140" w:line="300"/>
-      </w:pPr>
-      <w:r>
-        <w:t xml:space="preserve">I know how important it is to find support staff and seniors who understand positive behaviour support and person-centred practice for people with learning disabilities. If you have roles like that now or coming up, I would be glad to help.</w:t>
+        <w:t xml:space="preserve">I am contacting a small number of providers close to Swanley, including Kent Carers Limited in Dartford.</w:t>
+      </w:r>
+    </w:p>
+    <w:p>
+      <w:pPr>
+        <w:spacing w:after="140" w:line="300"/>
+      </w:pPr>
+      <w:r>
+        <w:t xml:space="preserve">In my experience, reliable care workers who drive, care coordinators and field care supervisors are often the hardest home care roles to fill. If any of those are open now or coming up, I would be glad to help.</w:t>
       </w:r>
     </w:p>
     <w:p>
@@ -2487,19 +3059,19 @@
         <w:pStyle w:val="Heading1"/>
       </w:pPr>
       <w:r>
-        <w:t xml:space="preserve">16. Groveland Park Care Home</w:t>
-      </w:r>
-    </w:p>
-    <w:p>
-      <w:pPr>
-        <w:spacing w:after="140" w:line="300"/>
-      </w:pPr>
-      <w:r>
-        <w:rPr>
-          <w:i/>
-          <w:iCs/>
-        </w:rPr>
-        <w:t xml:space="preserve">Residential home, Bexleyheath DA7 6EF | Priority B | Email: ask on the call or use their website contact form</w:t>
+        <w:t xml:space="preserve">20. Athlone Care</w:t>
+      </w:r>
+    </w:p>
+    <w:p>
+      <w:pPr>
+        <w:spacing w:after="140" w:line="300"/>
+      </w:pPr>
+      <w:r>
+        <w:rPr>
+          <w:i/>
+          <w:iCs/>
+        </w:rPr>
+        <w:t xml:space="preserve">Home care, Dartford DA1 1RX | Priority C | To: Mr David Mugwangi | Email: ask on the call or use their website contact form</w:t>
       </w:r>
     </w:p>
     <w:p>
@@ -2514,578 +3086,6 @@
         <w:t xml:space="preserve">Subject:</w:t>
       </w:r>
       <w:r>
-        <w:t xml:space="preserve"> Care recruitment for Groveland Park Care Home</w:t>
-      </w:r>
-    </w:p>
-    <w:p>
-      <w:pPr>
-        <w:spacing w:after="140" w:line="300"/>
-      </w:pPr>
-      <w:r>
-        <w:t xml:space="preserve">Dear Manager,</w:t>
-      </w:r>
-    </w:p>
-    <w:p>
-      <w:pPr>
-        <w:spacing w:after="140" w:line="300"/>
-      </w:pPr>
-      <w:r>
-        <w:t xml:space="preserve">I am a former CQC Registered Manager with around 15 years in adult social care, and I have set up Haverton Recruitment, a local specialist recruitment agency for care providers around Swanley, Dartford, Bexley and Bromley.</w:t>
-      </w:r>
-    </w:p>
-    <w:p>
-      <w:pPr>
-        <w:spacing w:after="140" w:line="300"/>
-      </w:pPr>
-      <w:r>
-        <w:t xml:space="preserve">I am contacting a small number of providers close to Swanley, including Groveland Park Care Home in Bexleyheath.</w:t>
-      </w:r>
-    </w:p>
-    <w:p>
-      <w:pPr>
-        <w:spacing w:after="140" w:line="300"/>
-      </w:pPr>
-      <w:r>
-        <w:t xml:space="preserve">If you have care, senior or management roles that are hard to fill, now or in the next few months, I would be glad to help.</w:t>
-      </w:r>
-    </w:p>
-    <w:p>
-      <w:pPr>
-        <w:spacing w:after="140" w:line="300"/>
-      </w:pPr>
-      <w:r>
-        <w:t xml:space="preserve">I screen every candidate by interview and check work history, references and qualifications before any introduction. You pay only if you hire someone I introduce.</w:t>
-      </w:r>
-    </w:p>
-    <w:p>
-      <w:pPr>
-        <w:spacing w:after="140" w:line="300"/>
-      </w:pPr>
-      <w:r>
-        <w:t xml:space="preserve">Could we speak for 15 minutes in the next week or two?</w:t>
-      </w:r>
-    </w:p>
-    <w:p>
-      <w:pPr>
-        <w:spacing w:after="140" w:line="300"/>
-      </w:pPr>
-      <w:r>
-        <w:t xml:space="preserve">Kind regards,</w:t>
-      </w:r>
-    </w:p>
-    <w:p>
-      <w:pPr>
-        <w:spacing w:after="140" w:line="300"/>
-      </w:pPr>
-      <w:r>
-        <w:rPr>
-          <w:b/>
-          <w:bCs/>
-        </w:rPr>
-        <w:t xml:space="preserve">Suroj Aryal</w:t>
-      </w:r>
-    </w:p>
-    <w:p>
-      <w:pPr>
-        <w:spacing w:after="140" w:line="300"/>
-      </w:pPr>
-      <w:r>
-        <w:t xml:space="preserve">Founder and Director, Haverton Recruitment And Staffing</w:t>
-      </w:r>
-    </w:p>
-    <w:p>
-      <w:pPr>
-        <w:spacing w:after="140" w:line="300"/>
-      </w:pPr>
-      <w:r>
-        <w:t xml:space="preserve">01322 879778 | info@havertoncare.co.uk | havertoncare.co.uk</w:t>
-      </w:r>
-    </w:p>
-    <w:p>
-      <w:pPr>
-        <w:spacing w:after="140" w:line="300"/>
-      </w:pPr>
-      <w:r>
-        <w:rPr>
-          <w:i/>
-          <w:iCs/>
-        </w:rPr>
-        <w:t xml:space="preserve">Haverton Care Limited, registered in England and Wales, company number 17025493. Registered office: 128 City Road, London, EC1V 2NX.</w:t>
-      </w:r>
-    </w:p>
-    <w:p>
-      <w:pPr>
-        <w:spacing w:after="140" w:line="300"/>
-      </w:pPr>
-      <w:r>
-        <w:rPr>
-          <w:i/>
-          <w:iCs/>
-        </w:rPr>
-        <w:t xml:space="preserve">If you would rather not hear from me, just reply "no thanks" and I will not contact you again.</w:t>
-      </w:r>
-    </w:p>
-    <w:p>
-      <w:pPr>
-        <w:pStyle w:val="Heading1"/>
-      </w:pPr>
-      <w:r>
-        <w:t xml:space="preserve">17. Russell Court Nursing Home</w:t>
-      </w:r>
-    </w:p>
-    <w:p>
-      <w:pPr>
-        <w:spacing w:after="140" w:line="300"/>
-      </w:pPr>
-      <w:r>
-        <w:rPr>
-          <w:i/>
-          <w:iCs/>
-        </w:rPr>
-        <w:t xml:space="preserve">Nursing home, Longfield DA3 7RY | Priority B | Email: ask on the call or use their website contact form</w:t>
-      </w:r>
-    </w:p>
-    <w:p>
-      <w:pPr>
-        <w:spacing w:after="140" w:line="300"/>
-      </w:pPr>
-      <w:r>
-        <w:rPr>
-          <w:b/>
-          <w:bCs/>
-        </w:rPr>
-        <w:t xml:space="preserve">Subject:</w:t>
-      </w:r>
-      <w:r>
-        <w:t xml:space="preserve"> Care recruitment for Russell Court Nursing Home</w:t>
-      </w:r>
-    </w:p>
-    <w:p>
-      <w:pPr>
-        <w:spacing w:after="140" w:line="300"/>
-      </w:pPr>
-      <w:r>
-        <w:t xml:space="preserve">Dear Manager,</w:t>
-      </w:r>
-    </w:p>
-    <w:p>
-      <w:pPr>
-        <w:spacing w:after="140" w:line="300"/>
-      </w:pPr>
-      <w:r>
-        <w:t xml:space="preserve">I am a former CQC Registered Manager with around 15 years in adult social care, and I have set up Haverton Recruitment, a local specialist recruitment agency for care providers around Swanley, Dartford, Bexley and Bromley.</w:t>
-      </w:r>
-    </w:p>
-    <w:p>
-      <w:pPr>
-        <w:spacing w:after="140" w:line="300"/>
-      </w:pPr>
-      <w:r>
-        <w:t xml:space="preserve">I am contacting a small number of providers close to Swanley, including Russell Court Nursing Home in Longfield.</w:t>
-      </w:r>
-    </w:p>
-    <w:p>
-      <w:pPr>
-        <w:spacing w:after="140" w:line="300"/>
-      </w:pPr>
-      <w:r>
-        <w:t xml:space="preserve">From my own time as a Registered Manager, I know senior carers, deputy managers and nurse leaders are often the hardest roles to fill. If any of those are open now or coming up, I would be glad to help.</w:t>
-      </w:r>
-    </w:p>
-    <w:p>
-      <w:pPr>
-        <w:spacing w:after="140" w:line="300"/>
-      </w:pPr>
-      <w:r>
-        <w:t xml:space="preserve">I screen every candidate by interview and check work history, references and qualifications before any introduction. You pay only if you hire someone I introduce.</w:t>
-      </w:r>
-    </w:p>
-    <w:p>
-      <w:pPr>
-        <w:spacing w:after="140" w:line="300"/>
-      </w:pPr>
-      <w:r>
-        <w:t xml:space="preserve">Could we speak for 15 minutes in the next week or two?</w:t>
-      </w:r>
-    </w:p>
-    <w:p>
-      <w:pPr>
-        <w:spacing w:after="140" w:line="300"/>
-      </w:pPr>
-      <w:r>
-        <w:t xml:space="preserve">Kind regards,</w:t>
-      </w:r>
-    </w:p>
-    <w:p>
-      <w:pPr>
-        <w:spacing w:after="140" w:line="300"/>
-      </w:pPr>
-      <w:r>
-        <w:rPr>
-          <w:b/>
-          <w:bCs/>
-        </w:rPr>
-        <w:t xml:space="preserve">Suroj Aryal</w:t>
-      </w:r>
-    </w:p>
-    <w:p>
-      <w:pPr>
-        <w:spacing w:after="140" w:line="300"/>
-      </w:pPr>
-      <w:r>
-        <w:t xml:space="preserve">Founder and Director, Haverton Recruitment And Staffing</w:t>
-      </w:r>
-    </w:p>
-    <w:p>
-      <w:pPr>
-        <w:spacing w:after="140" w:line="300"/>
-      </w:pPr>
-      <w:r>
-        <w:t xml:space="preserve">01322 879778 | info@havertoncare.co.uk | havertoncare.co.uk</w:t>
-      </w:r>
-    </w:p>
-    <w:p>
-      <w:pPr>
-        <w:spacing w:after="140" w:line="300"/>
-      </w:pPr>
-      <w:r>
-        <w:rPr>
-          <w:i/>
-          <w:iCs/>
-        </w:rPr>
-        <w:t xml:space="preserve">Haverton Care Limited, registered in England and Wales, company number 17025493. Registered office: 128 City Road, London, EC1V 2NX.</w:t>
-      </w:r>
-    </w:p>
-    <w:p>
-      <w:pPr>
-        <w:spacing w:after="140" w:line="300"/>
-      </w:pPr>
-      <w:r>
-        <w:rPr>
-          <w:i/>
-          <w:iCs/>
-        </w:rPr>
-        <w:t xml:space="preserve">If you would rather not hear from me, just reply "no thanks" and I will not contact you again.</w:t>
-      </w:r>
-    </w:p>
-    <w:p>
-      <w:pPr>
-        <w:pStyle w:val="Heading1"/>
-      </w:pPr>
-      <w:r>
-        <w:t xml:space="preserve">18. Bramblings Residential Home</w:t>
-      </w:r>
-    </w:p>
-    <w:p>
-      <w:pPr>
-        <w:spacing w:after="140" w:line="300"/>
-      </w:pPr>
-      <w:r>
-        <w:rPr>
-          <w:i/>
-          <w:iCs/>
-        </w:rPr>
-        <w:t xml:space="preserve">Residential home, Hartley DA3 7PE | Priority B | Email: info@bramblingscare.co.uk</w:t>
-      </w:r>
-    </w:p>
-    <w:p>
-      <w:pPr>
-        <w:spacing w:after="140" w:line="300"/>
-      </w:pPr>
-      <w:r>
-        <w:rPr>
-          <w:b/>
-          <w:bCs/>
-        </w:rPr>
-        <w:t xml:space="preserve">Subject:</w:t>
-      </w:r>
-      <w:r>
-        <w:t xml:space="preserve"> Care recruitment for Bramblings Residential Home</w:t>
-      </w:r>
-    </w:p>
-    <w:p>
-      <w:pPr>
-        <w:spacing w:after="140" w:line="300"/>
-      </w:pPr>
-      <w:r>
-        <w:t xml:space="preserve">Dear Manager,</w:t>
-      </w:r>
-    </w:p>
-    <w:p>
-      <w:pPr>
-        <w:spacing w:after="140" w:line="300"/>
-      </w:pPr>
-      <w:r>
-        <w:t xml:space="preserve">I am a former CQC Registered Manager with around 15 years in adult social care, and I have set up Haverton Recruitment, a local specialist recruitment agency for care providers around Swanley, Dartford, Bexley and Bromley.</w:t>
-      </w:r>
-    </w:p>
-    <w:p>
-      <w:pPr>
-        <w:spacing w:after="140" w:line="300"/>
-      </w:pPr>
-      <w:r>
-        <w:t xml:space="preserve">I am contacting a small number of providers close to Swanley, including Bramblings Residential Home in Hartley.</w:t>
-      </w:r>
-    </w:p>
-    <w:p>
-      <w:pPr>
-        <w:spacing w:after="140" w:line="300"/>
-      </w:pPr>
-      <w:r>
-        <w:t xml:space="preserve">If you have care, senior or management roles that are hard to fill, now or in the next few months, I would be glad to help.</w:t>
-      </w:r>
-    </w:p>
-    <w:p>
-      <w:pPr>
-        <w:spacing w:after="140" w:line="300"/>
-      </w:pPr>
-      <w:r>
-        <w:t xml:space="preserve">I screen every candidate by interview and check work history, references and qualifications before any introduction. You pay only if you hire someone I introduce.</w:t>
-      </w:r>
-    </w:p>
-    <w:p>
-      <w:pPr>
-        <w:spacing w:after="140" w:line="300"/>
-      </w:pPr>
-      <w:r>
-        <w:t xml:space="preserve">Could we speak for 15 minutes in the next week or two?</w:t>
-      </w:r>
-    </w:p>
-    <w:p>
-      <w:pPr>
-        <w:spacing w:after="140" w:line="300"/>
-      </w:pPr>
-      <w:r>
-        <w:t xml:space="preserve">Kind regards,</w:t>
-      </w:r>
-    </w:p>
-    <w:p>
-      <w:pPr>
-        <w:spacing w:after="140" w:line="300"/>
-      </w:pPr>
-      <w:r>
-        <w:rPr>
-          <w:b/>
-          <w:bCs/>
-        </w:rPr>
-        <w:t xml:space="preserve">Suroj Aryal</w:t>
-      </w:r>
-    </w:p>
-    <w:p>
-      <w:pPr>
-        <w:spacing w:after="140" w:line="300"/>
-      </w:pPr>
-      <w:r>
-        <w:t xml:space="preserve">Founder and Director, Haverton Recruitment And Staffing</w:t>
-      </w:r>
-    </w:p>
-    <w:p>
-      <w:pPr>
-        <w:spacing w:after="140" w:line="300"/>
-      </w:pPr>
-      <w:r>
-        <w:t xml:space="preserve">01322 879778 | info@havertoncare.co.uk | havertoncare.co.uk</w:t>
-      </w:r>
-    </w:p>
-    <w:p>
-      <w:pPr>
-        <w:spacing w:after="140" w:line="300"/>
-      </w:pPr>
-      <w:r>
-        <w:rPr>
-          <w:i/>
-          <w:iCs/>
-        </w:rPr>
-        <w:t xml:space="preserve">Haverton Care Limited, registered in England and Wales, company number 17025493. Registered office: 128 City Road, London, EC1V 2NX.</w:t>
-      </w:r>
-    </w:p>
-    <w:p>
-      <w:pPr>
-        <w:spacing w:after="140" w:line="300"/>
-      </w:pPr>
-      <w:r>
-        <w:rPr>
-          <w:i/>
-          <w:iCs/>
-        </w:rPr>
-        <w:t xml:space="preserve">If you would rather not hear from me, just reply "no thanks" and I will not contact you again.</w:t>
-      </w:r>
-    </w:p>
-    <w:p>
-      <w:pPr>
-        <w:pStyle w:val="Heading1"/>
-      </w:pPr>
-      <w:r>
-        <w:t xml:space="preserve">19. Kent Carers Limited - Head Office</w:t>
-      </w:r>
-    </w:p>
-    <w:p>
-      <w:pPr>
-        <w:spacing w:after="140" w:line="300"/>
-      </w:pPr>
-      <w:r>
-        <w:rPr>
-          <w:i/>
-          <w:iCs/>
-        </w:rPr>
-        <w:t xml:space="preserve">Home care, Dartford DA2 7SL | Priority C | Email: info@kentcarers.co.uk</w:t>
-      </w:r>
-    </w:p>
-    <w:p>
-      <w:pPr>
-        <w:spacing w:after="140" w:line="300"/>
-      </w:pPr>
-      <w:r>
-        <w:rPr>
-          <w:b/>
-          <w:bCs/>
-        </w:rPr>
-        <w:t xml:space="preserve">Subject:</w:t>
-      </w:r>
-      <w:r>
-        <w:t xml:space="preserve"> Care recruitment for Kent Carers Limited</w:t>
-      </w:r>
-    </w:p>
-    <w:p>
-      <w:pPr>
-        <w:spacing w:after="140" w:line="300"/>
-      </w:pPr>
-      <w:r>
-        <w:t xml:space="preserve">Dear Manager,</w:t>
-      </w:r>
-    </w:p>
-    <w:p>
-      <w:pPr>
-        <w:spacing w:after="140" w:line="300"/>
-      </w:pPr>
-      <w:r>
-        <w:t xml:space="preserve">I am a former CQC Registered Manager with around 15 years in adult social care, and I have set up Haverton Recruitment, a local specialist recruitment agency for care providers around Swanley, Dartford, Bexley and Bromley.</w:t>
-      </w:r>
-    </w:p>
-    <w:p>
-      <w:pPr>
-        <w:spacing w:after="140" w:line="300"/>
-      </w:pPr>
-      <w:r>
-        <w:t xml:space="preserve">I am contacting a small number of providers close to Swanley, including Kent Carers Limited in Dartford.</w:t>
-      </w:r>
-    </w:p>
-    <w:p>
-      <w:pPr>
-        <w:spacing w:after="140" w:line="300"/>
-      </w:pPr>
-      <w:r>
-        <w:t xml:space="preserve">In my experience, reliable care workers who drive, care coordinators and field care supervisors are often the hardest home care roles to fill. If any of those are open now or coming up, I would be glad to help.</w:t>
-      </w:r>
-    </w:p>
-    <w:p>
-      <w:pPr>
-        <w:spacing w:after="140" w:line="300"/>
-      </w:pPr>
-      <w:r>
-        <w:t xml:space="preserve">I screen every candidate by interview and check work history, references and qualifications before any introduction. You pay only if you hire someone I introduce.</w:t>
-      </w:r>
-    </w:p>
-    <w:p>
-      <w:pPr>
-        <w:spacing w:after="140" w:line="300"/>
-      </w:pPr>
-      <w:r>
-        <w:t xml:space="preserve">Could we speak for 15 minutes in the next week or two?</w:t>
-      </w:r>
-    </w:p>
-    <w:p>
-      <w:pPr>
-        <w:spacing w:after="140" w:line="300"/>
-      </w:pPr>
-      <w:r>
-        <w:t xml:space="preserve">Kind regards,</w:t>
-      </w:r>
-    </w:p>
-    <w:p>
-      <w:pPr>
-        <w:spacing w:after="140" w:line="300"/>
-      </w:pPr>
-      <w:r>
-        <w:rPr>
-          <w:b/>
-          <w:bCs/>
-        </w:rPr>
-        <w:t xml:space="preserve">Suroj Aryal</w:t>
-      </w:r>
-    </w:p>
-    <w:p>
-      <w:pPr>
-        <w:spacing w:after="140" w:line="300"/>
-      </w:pPr>
-      <w:r>
-        <w:t xml:space="preserve">Founder and Director, Haverton Recruitment And Staffing</w:t>
-      </w:r>
-    </w:p>
-    <w:p>
-      <w:pPr>
-        <w:spacing w:after="140" w:line="300"/>
-      </w:pPr>
-      <w:r>
-        <w:t xml:space="preserve">01322 879778 | info@havertoncare.co.uk | havertoncare.co.uk</w:t>
-      </w:r>
-    </w:p>
-    <w:p>
-      <w:pPr>
-        <w:spacing w:after="140" w:line="300"/>
-      </w:pPr>
-      <w:r>
-        <w:rPr>
-          <w:i/>
-          <w:iCs/>
-        </w:rPr>
-        <w:t xml:space="preserve">Haverton Care Limited, registered in England and Wales, company number 17025493. Registered office: 128 City Road, London, EC1V 2NX.</w:t>
-      </w:r>
-    </w:p>
-    <w:p>
-      <w:pPr>
-        <w:spacing w:after="140" w:line="300"/>
-      </w:pPr>
-      <w:r>
-        <w:rPr>
-          <w:i/>
-          <w:iCs/>
-        </w:rPr>
-        <w:t xml:space="preserve">If you would rather not hear from me, just reply "no thanks" and I will not contact you again.</w:t>
-      </w:r>
-    </w:p>
-    <w:p>
-      <w:pPr>
-        <w:pStyle w:val="Heading1"/>
-      </w:pPr>
-      <w:r>
-        <w:t xml:space="preserve">20. Athlone Care</w:t>
-      </w:r>
-    </w:p>
-    <w:p>
-      <w:pPr>
-        <w:spacing w:after="140" w:line="300"/>
-      </w:pPr>
-      <w:r>
-        <w:rPr>
-          <w:i/>
-          <w:iCs/>
-        </w:rPr>
-        <w:t xml:space="preserve">Home care, Dartford DA1 1RX | Priority C | Email: ask on the call or use their website contact form</w:t>
-      </w:r>
-    </w:p>
-    <w:p>
-      <w:pPr>
-        <w:spacing w:after="140" w:line="300"/>
-      </w:pPr>
-      <w:r>
-        <w:rPr>
-          <w:b/>
-          <w:bCs/>
-        </w:rPr>
-        <w:t xml:space="preserve">Subject:</w:t>
-      </w:r>
-      <w:r>
         <w:t xml:space="preserve"> Care recruitment for Athlone Care</w:t>
       </w:r>
     </w:p>
@@ -3094,7 +3094,7 @@
         <w:spacing w:after="140" w:line="300"/>
       </w:pPr>
       <w:r>
-        <w:t xml:space="preserve">Dear Manager,</w:t>
+        <w:t xml:space="preserve">Dear Mr Mugwangi,</w:t>
       </w:r>
     </w:p>
     <w:p>

</xml_diff>

<commit_message>
Tell named contacts where their details came from (UK GDPR article 14)
Co-Authored-By: Claude Opus 5.5 <noreply@anthropic.com>
Claude-Session: https://claude.ai/code/session_01XByJMQfkaq2do2XmLu4Dhj
</commit_message>
<xml_diff>
--- a/documents/Haverton Recruitment/8 First Client/This Week Emails.docx
+++ b/documents/Haverton Recruitment/8 First Client/This Week Emails.docx
@@ -477,7 +477,7 @@
           <w:i/>
           <w:iCs/>
         </w:rPr>
-        <w:t xml:space="preserve">If you would rather not hear from me, just reply "no thanks" and I will not contact you again.</w:t>
+        <w:t xml:space="preserve">I found your name on your service's public CQC page. Our privacy notice explains how we use business contact details and your rights: havertoncare.co.uk [confirm privacy notice link]. If you would rather not hear from me, just reply "no thanks" and I will not contact you again.</w:t>
       </w:r>
     </w:p>
     <w:p>
@@ -620,7 +620,7 @@
           <w:i/>
           <w:iCs/>
         </w:rPr>
-        <w:t xml:space="preserve">If you would rather not hear from me, just reply "no thanks" and I will not contact you again.</w:t>
+        <w:t xml:space="preserve">I found your name on your service's public CQC page. Our privacy notice explains how we use business contact details and your rights: havertoncare.co.uk [confirm privacy notice link]. If you would rather not hear from me, just reply "no thanks" and I will not contact you again.</w:t>
       </w:r>
     </w:p>
     <w:p>
@@ -763,7 +763,7 @@
           <w:i/>
           <w:iCs/>
         </w:rPr>
-        <w:t xml:space="preserve">If you would rather not hear from me, just reply "no thanks" and I will not contact you again.</w:t>
+        <w:t xml:space="preserve">I found your name on your service's public CQC page. Our privacy notice explains how we use business contact details and your rights: havertoncare.co.uk [confirm privacy notice link]. If you would rather not hear from me, just reply "no thanks" and I will not contact you again.</w:t>
       </w:r>
     </w:p>
     <w:p>
@@ -906,7 +906,7 @@
           <w:i/>
           <w:iCs/>
         </w:rPr>
-        <w:t xml:space="preserve">If you would rather not hear from me, just reply "no thanks" and I will not contact you again.</w:t>
+        <w:t xml:space="preserve">I found your name on your service's public CQC page. Our privacy notice explains how we use business contact details and your rights: havertoncare.co.uk [confirm privacy notice link]. If you would rather not hear from me, just reply "no thanks" and I will not contact you again.</w:t>
       </w:r>
     </w:p>
     <w:p>
@@ -1049,7 +1049,7 @@
           <w:i/>
           <w:iCs/>
         </w:rPr>
-        <w:t xml:space="preserve">If you would rather not hear from me, just reply "no thanks" and I will not contact you again.</w:t>
+        <w:t xml:space="preserve">I found your name on your service's public CQC page. Our privacy notice explains how we use business contact details and your rights: havertoncare.co.uk [confirm privacy notice link]. If you would rather not hear from me, just reply "no thanks" and I will not contact you again.</w:t>
       </w:r>
     </w:p>
     <w:p>
@@ -1192,7 +1192,7 @@
           <w:i/>
           <w:iCs/>
         </w:rPr>
-        <w:t xml:space="preserve">If you would rather not hear from me, just reply "no thanks" and I will not contact you again.</w:t>
+        <w:t xml:space="preserve">I found your name on your service's public CQC page. Our privacy notice explains how we use business contact details and your rights: havertoncare.co.uk [confirm privacy notice link]. If you would rather not hear from me, just reply "no thanks" and I will not contact you again.</w:t>
       </w:r>
     </w:p>
     <w:p>
@@ -1335,7 +1335,7 @@
           <w:i/>
           <w:iCs/>
         </w:rPr>
-        <w:t xml:space="preserve">If you would rather not hear from me, just reply "no thanks" and I will not contact you again.</w:t>
+        <w:t xml:space="preserve">I found your name on your service's public CQC page. Our privacy notice explains how we use business contact details and your rights: havertoncare.co.uk [confirm privacy notice link]. If you would rather not hear from me, just reply "no thanks" and I will not contact you again.</w:t>
       </w:r>
     </w:p>
     <w:p>
@@ -1478,7 +1478,7 @@
           <w:i/>
           <w:iCs/>
         </w:rPr>
-        <w:t xml:space="preserve">If you would rather not hear from me, just reply "no thanks" and I will not contact you again.</w:t>
+        <w:t xml:space="preserve">I found your name on your service's public CQC page. Our privacy notice explains how we use business contact details and your rights: havertoncare.co.uk [confirm privacy notice link]. If you would rather not hear from me, just reply "no thanks" and I will not contact you again.</w:t>
       </w:r>
     </w:p>
     <w:p>
@@ -1621,7 +1621,7 @@
           <w:i/>
           <w:iCs/>
         </w:rPr>
-        <w:t xml:space="preserve">If you would rather not hear from me, just reply "no thanks" and I will not contact you again.</w:t>
+        <w:t xml:space="preserve">I found your name on your service's public CQC page. Our privacy notice explains how we use business contact details and your rights: havertoncare.co.uk [confirm privacy notice link]. If you would rather not hear from me, just reply "no thanks" and I will not contact you again.</w:t>
       </w:r>
     </w:p>
     <w:p>
@@ -1764,7 +1764,7 @@
           <w:i/>
           <w:iCs/>
         </w:rPr>
-        <w:t xml:space="preserve">If you would rather not hear from me, just reply "no thanks" and I will not contact you again.</w:t>
+        <w:t xml:space="preserve">I found your name on your service's public CQC page. Our privacy notice explains how we use business contact details and your rights: havertoncare.co.uk [confirm privacy notice link]. If you would rather not hear from me, just reply "no thanks" and I will not contact you again.</w:t>
       </w:r>
     </w:p>
     <w:p>
@@ -1907,7 +1907,7 @@
           <w:i/>
           <w:iCs/>
         </w:rPr>
-        <w:t xml:space="preserve">If you would rather not hear from me, just reply "no thanks" and I will not contact you again.</w:t>
+        <w:t xml:space="preserve">I found your name on your service's public CQC page. Our privacy notice explains how we use business contact details and your rights: havertoncare.co.uk [confirm privacy notice link]. If you would rather not hear from me, just reply "no thanks" and I will not contact you again.</w:t>
       </w:r>
     </w:p>
     <w:p>
@@ -2050,7 +2050,7 @@
           <w:i/>
           <w:iCs/>
         </w:rPr>
-        <w:t xml:space="preserve">If you would rather not hear from me, just reply "no thanks" and I will not contact you again.</w:t>
+        <w:t xml:space="preserve">I found your name on your service's public CQC page. Our privacy notice explains how we use business contact details and your rights: havertoncare.co.uk [confirm privacy notice link]. If you would rather not hear from me, just reply "no thanks" and I will not contact you again.</w:t>
       </w:r>
     </w:p>
     <w:p>
@@ -2193,7 +2193,7 @@
           <w:i/>
           <w:iCs/>
         </w:rPr>
-        <w:t xml:space="preserve">If you would rather not hear from me, just reply "no thanks" and I will not contact you again.</w:t>
+        <w:t xml:space="preserve">I found your name on your service's public CQC page. Our privacy notice explains how we use business contact details and your rights: havertoncare.co.uk [confirm privacy notice link]. If you would rather not hear from me, just reply "no thanks" and I will not contact you again.</w:t>
       </w:r>
     </w:p>
     <w:p>
@@ -2336,7 +2336,7 @@
           <w:i/>
           <w:iCs/>
         </w:rPr>
-        <w:t xml:space="preserve">If you would rather not hear from me, just reply "no thanks" and I will not contact you again.</w:t>
+        <w:t xml:space="preserve">I found your name on your service's public CQC page. Our privacy notice explains how we use business contact details and your rights: havertoncare.co.uk [confirm privacy notice link]. If you would rather not hear from me, just reply "no thanks" and I will not contact you again.</w:t>
       </w:r>
     </w:p>
     <w:p>
@@ -2479,7 +2479,7 @@
           <w:i/>
           <w:iCs/>
         </w:rPr>
-        <w:t xml:space="preserve">If you would rather not hear from me, just reply "no thanks" and I will not contact you again.</w:t>
+        <w:t xml:space="preserve">I found your name on your service's public CQC page. Our privacy notice explains how we use business contact details and your rights: havertoncare.co.uk [confirm privacy notice link]. If you would rather not hear from me, just reply "no thanks" and I will not contact you again.</w:t>
       </w:r>
     </w:p>
     <w:p>
@@ -2622,7 +2622,7 @@
           <w:i/>
           <w:iCs/>
         </w:rPr>
-        <w:t xml:space="preserve">If you would rather not hear from me, just reply "no thanks" and I will not contact you again.</w:t>
+        <w:t xml:space="preserve">I found your name on your service's public CQC page. Our privacy notice explains how we use business contact details and your rights: havertoncare.co.uk [confirm privacy notice link]. If you would rather not hear from me, just reply "no thanks" and I will not contact you again.</w:t>
       </w:r>
     </w:p>
     <w:p>
@@ -2765,7 +2765,7 @@
           <w:i/>
           <w:iCs/>
         </w:rPr>
-        <w:t xml:space="preserve">If you would rather not hear from me, just reply "no thanks" and I will not contact you again.</w:t>
+        <w:t xml:space="preserve">I found your name on your service's public CQC page. Our privacy notice explains how we use business contact details and your rights: havertoncare.co.uk [confirm privacy notice link]. If you would rather not hear from me, just reply "no thanks" and I will not contact you again.</w:t>
       </w:r>
     </w:p>
     <w:p>
@@ -2908,7 +2908,7 @@
           <w:i/>
           <w:iCs/>
         </w:rPr>
-        <w:t xml:space="preserve">If you would rather not hear from me, just reply "no thanks" and I will not contact you again.</w:t>
+        <w:t xml:space="preserve">I found your name on your service's public CQC page. Our privacy notice explains how we use business contact details and your rights: havertoncare.co.uk [confirm privacy notice link]. If you would rather not hear from me, just reply "no thanks" and I will not contact you again.</w:t>
       </w:r>
     </w:p>
     <w:p>
@@ -3051,7 +3051,7 @@
           <w:i/>
           <w:iCs/>
         </w:rPr>
-        <w:t xml:space="preserve">If you would rather not hear from me, just reply "no thanks" and I will not contact you again.</w:t>
+        <w:t xml:space="preserve">I found your name on your service's public CQC page. Our privacy notice explains how we use business contact details and your rights: havertoncare.co.uk [confirm privacy notice link]. If you would rather not hear from me, just reply "no thanks" and I will not contact you again.</w:t>
       </w:r>
     </w:p>
     <w:p>
@@ -3194,7 +3194,7 @@
           <w:i/>
           <w:iCs/>
         </w:rPr>
-        <w:t xml:space="preserve">If you would rather not hear from me, just reply "no thanks" and I will not contact you again.</w:t>
+        <w:t xml:space="preserve">I found your name on your service's public CQC page. Our privacy notice explains how we use business contact details and your rights: havertoncare.co.uk [confirm privacy notice link]. If you would rather not hear from me, just reply "no thanks" and I will not contact you again.</w:t>
       </w:r>
     </w:p>
     <w:p>
@@ -3301,7 +3301,7 @@
           <w:i/>
           <w:iCs/>
         </w:rPr>
-        <w:t xml:space="preserve">If you would rather not hear from me, just reply "no thanks" and I will not contact you again.</w:t>
+        <w:t xml:space="preserve">I found your name on your service's public CQC page. Our privacy notice explains how we use business contact details and your rights: havertoncare.co.uk [confirm privacy notice link]. If you would rather not hear from me, just reply "no thanks" and I will not contact you again.</w:t>
       </w:r>
     </w:p>
     <w:sectPr>

</xml_diff>